<commit_message>
Add detailed Developer Guide (docx); fix list numbering in Word docs
Co-Authored-By: Claude Sonnet 5.5 <noreply@anthropic.com>
</commit_message>
<xml_diff>
--- a/docs/Project_Explainer.docx
+++ b/docs/Project_Explainer.docx
@@ -2117,7 +2117,7 @@
         <w:pStyle w:val="ListParagraph"/>
         <w:numPr>
           <w:ilvl w:val="0"/>
-          <w:numId w:val="2"/>
+          <w:numId w:val="4"/>
         </w:numPr>
         <w:spacing w:after="60"/>
       </w:pPr>
@@ -2133,7 +2133,7 @@
         <w:pStyle w:val="ListParagraph"/>
         <w:numPr>
           <w:ilvl w:val="0"/>
-          <w:numId w:val="2"/>
+          <w:numId w:val="4"/>
         </w:numPr>
         <w:spacing w:after="60"/>
       </w:pPr>
@@ -2149,7 +2149,7 @@
         <w:pStyle w:val="ListParagraph"/>
         <w:numPr>
           <w:ilvl w:val="0"/>
-          <w:numId w:val="2"/>
+          <w:numId w:val="4"/>
         </w:numPr>
         <w:spacing w:after="60"/>
       </w:pPr>
@@ -2165,7 +2165,7 @@
         <w:pStyle w:val="ListParagraph"/>
         <w:numPr>
           <w:ilvl w:val="0"/>
-          <w:numId w:val="2"/>
+          <w:numId w:val="4"/>
         </w:numPr>
         <w:spacing w:after="60"/>
       </w:pPr>
@@ -2411,6 +2411,954 @@
       </w:pPr>
     </w:lvl>
   </w:abstractNum>
+  <w:abstractNum w:abstractNumId="4" w15:restartNumberingAfterBreak="0">
+    <w:multiLevelType w:val="hybridMultilevel"/>
+    <w:lvl w:ilvl="0" w:tentative="1">
+      <w:start w:val="1"/>
+      <w:numFmt w:val="decimal"/>
+      <w:lvlText w:val="%1."/>
+      <w:lvlJc w:val="left"/>
+      <w:pPr>
+        <w:ind w:left="540" w:hanging="360"/>
+      </w:pPr>
+    </w:lvl>
+  </w:abstractNum>
+  <w:abstractNum w:abstractNumId="5" w15:restartNumberingAfterBreak="0">
+    <w:multiLevelType w:val="hybridMultilevel"/>
+    <w:lvl w:ilvl="0" w:tentative="1">
+      <w:start w:val="1"/>
+      <w:numFmt w:val="decimal"/>
+      <w:lvlText w:val="%1."/>
+      <w:lvlJc w:val="left"/>
+      <w:pPr>
+        <w:ind w:left="540" w:hanging="360"/>
+      </w:pPr>
+    </w:lvl>
+  </w:abstractNum>
+  <w:abstractNum w:abstractNumId="6" w15:restartNumberingAfterBreak="0">
+    <w:multiLevelType w:val="hybridMultilevel"/>
+    <w:lvl w:ilvl="0" w:tentative="1">
+      <w:start w:val="1"/>
+      <w:numFmt w:val="decimal"/>
+      <w:lvlText w:val="%1."/>
+      <w:lvlJc w:val="left"/>
+      <w:pPr>
+        <w:ind w:left="540" w:hanging="360"/>
+      </w:pPr>
+    </w:lvl>
+  </w:abstractNum>
+  <w:abstractNum w:abstractNumId="7" w15:restartNumberingAfterBreak="0">
+    <w:multiLevelType w:val="hybridMultilevel"/>
+    <w:lvl w:ilvl="0" w:tentative="1">
+      <w:start w:val="1"/>
+      <w:numFmt w:val="decimal"/>
+      <w:lvlText w:val="%1."/>
+      <w:lvlJc w:val="left"/>
+      <w:pPr>
+        <w:ind w:left="540" w:hanging="360"/>
+      </w:pPr>
+    </w:lvl>
+  </w:abstractNum>
+  <w:abstractNum w:abstractNumId="8" w15:restartNumberingAfterBreak="0">
+    <w:multiLevelType w:val="hybridMultilevel"/>
+    <w:lvl w:ilvl="0" w:tentative="1">
+      <w:start w:val="1"/>
+      <w:numFmt w:val="decimal"/>
+      <w:lvlText w:val="%1."/>
+      <w:lvlJc w:val="left"/>
+      <w:pPr>
+        <w:ind w:left="540" w:hanging="360"/>
+      </w:pPr>
+    </w:lvl>
+  </w:abstractNum>
+  <w:abstractNum w:abstractNumId="9" w15:restartNumberingAfterBreak="0">
+    <w:multiLevelType w:val="hybridMultilevel"/>
+    <w:lvl w:ilvl="0" w:tentative="1">
+      <w:start w:val="1"/>
+      <w:numFmt w:val="decimal"/>
+      <w:lvlText w:val="%1."/>
+      <w:lvlJc w:val="left"/>
+      <w:pPr>
+        <w:ind w:left="540" w:hanging="360"/>
+      </w:pPr>
+    </w:lvl>
+  </w:abstractNum>
+  <w:abstractNum w:abstractNumId="10" w15:restartNumberingAfterBreak="0">
+    <w:multiLevelType w:val="hybridMultilevel"/>
+    <w:lvl w:ilvl="0" w:tentative="1">
+      <w:start w:val="1"/>
+      <w:numFmt w:val="decimal"/>
+      <w:lvlText w:val="%1."/>
+      <w:lvlJc w:val="left"/>
+      <w:pPr>
+        <w:ind w:left="540" w:hanging="360"/>
+      </w:pPr>
+    </w:lvl>
+  </w:abstractNum>
+  <w:abstractNum w:abstractNumId="11" w15:restartNumberingAfterBreak="0">
+    <w:multiLevelType w:val="hybridMultilevel"/>
+    <w:lvl w:ilvl="0" w:tentative="1">
+      <w:start w:val="1"/>
+      <w:numFmt w:val="decimal"/>
+      <w:lvlText w:val="%1."/>
+      <w:lvlJc w:val="left"/>
+      <w:pPr>
+        <w:ind w:left="540" w:hanging="360"/>
+      </w:pPr>
+    </w:lvl>
+  </w:abstractNum>
+  <w:abstractNum w:abstractNumId="12" w15:restartNumberingAfterBreak="0">
+    <w:multiLevelType w:val="hybridMultilevel"/>
+    <w:lvl w:ilvl="0" w:tentative="1">
+      <w:start w:val="1"/>
+      <w:numFmt w:val="decimal"/>
+      <w:lvlText w:val="%1."/>
+      <w:lvlJc w:val="left"/>
+      <w:pPr>
+        <w:ind w:left="540" w:hanging="360"/>
+      </w:pPr>
+    </w:lvl>
+  </w:abstractNum>
+  <w:abstractNum w:abstractNumId="13" w15:restartNumberingAfterBreak="0">
+    <w:multiLevelType w:val="hybridMultilevel"/>
+    <w:lvl w:ilvl="0" w:tentative="1">
+      <w:start w:val="1"/>
+      <w:numFmt w:val="decimal"/>
+      <w:lvlText w:val="%1."/>
+      <w:lvlJc w:val="left"/>
+      <w:pPr>
+        <w:ind w:left="540" w:hanging="360"/>
+      </w:pPr>
+    </w:lvl>
+  </w:abstractNum>
+  <w:abstractNum w:abstractNumId="14" w15:restartNumberingAfterBreak="0">
+    <w:multiLevelType w:val="hybridMultilevel"/>
+    <w:lvl w:ilvl="0" w:tentative="1">
+      <w:start w:val="1"/>
+      <w:numFmt w:val="decimal"/>
+      <w:lvlText w:val="%1."/>
+      <w:lvlJc w:val="left"/>
+      <w:pPr>
+        <w:ind w:left="540" w:hanging="360"/>
+      </w:pPr>
+    </w:lvl>
+  </w:abstractNum>
+  <w:abstractNum w:abstractNumId="15" w15:restartNumberingAfterBreak="0">
+    <w:multiLevelType w:val="hybridMultilevel"/>
+    <w:lvl w:ilvl="0" w:tentative="1">
+      <w:start w:val="1"/>
+      <w:numFmt w:val="decimal"/>
+      <w:lvlText w:val="%1."/>
+      <w:lvlJc w:val="left"/>
+      <w:pPr>
+        <w:ind w:left="540" w:hanging="360"/>
+      </w:pPr>
+    </w:lvl>
+  </w:abstractNum>
+  <w:abstractNum w:abstractNumId="16" w15:restartNumberingAfterBreak="0">
+    <w:multiLevelType w:val="hybridMultilevel"/>
+    <w:lvl w:ilvl="0" w:tentative="1">
+      <w:start w:val="1"/>
+      <w:numFmt w:val="decimal"/>
+      <w:lvlText w:val="%1."/>
+      <w:lvlJc w:val="left"/>
+      <w:pPr>
+        <w:ind w:left="540" w:hanging="360"/>
+      </w:pPr>
+    </w:lvl>
+  </w:abstractNum>
+  <w:abstractNum w:abstractNumId="17" w15:restartNumberingAfterBreak="0">
+    <w:multiLevelType w:val="hybridMultilevel"/>
+    <w:lvl w:ilvl="0" w:tentative="1">
+      <w:start w:val="1"/>
+      <w:numFmt w:val="decimal"/>
+      <w:lvlText w:val="%1."/>
+      <w:lvlJc w:val="left"/>
+      <w:pPr>
+        <w:ind w:left="540" w:hanging="360"/>
+      </w:pPr>
+    </w:lvl>
+  </w:abstractNum>
+  <w:abstractNum w:abstractNumId="18" w15:restartNumberingAfterBreak="0">
+    <w:multiLevelType w:val="hybridMultilevel"/>
+    <w:lvl w:ilvl="0" w:tentative="1">
+      <w:start w:val="1"/>
+      <w:numFmt w:val="decimal"/>
+      <w:lvlText w:val="%1."/>
+      <w:lvlJc w:val="left"/>
+      <w:pPr>
+        <w:ind w:left="540" w:hanging="360"/>
+      </w:pPr>
+    </w:lvl>
+  </w:abstractNum>
+  <w:abstractNum w:abstractNumId="19" w15:restartNumberingAfterBreak="0">
+    <w:multiLevelType w:val="hybridMultilevel"/>
+    <w:lvl w:ilvl="0" w:tentative="1">
+      <w:start w:val="1"/>
+      <w:numFmt w:val="decimal"/>
+      <w:lvlText w:val="%1."/>
+      <w:lvlJc w:val="left"/>
+      <w:pPr>
+        <w:ind w:left="540" w:hanging="360"/>
+      </w:pPr>
+    </w:lvl>
+  </w:abstractNum>
+  <w:abstractNum w:abstractNumId="20" w15:restartNumberingAfterBreak="0">
+    <w:multiLevelType w:val="hybridMultilevel"/>
+    <w:lvl w:ilvl="0" w:tentative="1">
+      <w:start w:val="1"/>
+      <w:numFmt w:val="decimal"/>
+      <w:lvlText w:val="%1."/>
+      <w:lvlJc w:val="left"/>
+      <w:pPr>
+        <w:ind w:left="540" w:hanging="360"/>
+      </w:pPr>
+    </w:lvl>
+  </w:abstractNum>
+  <w:abstractNum w:abstractNumId="21" w15:restartNumberingAfterBreak="0">
+    <w:multiLevelType w:val="hybridMultilevel"/>
+    <w:lvl w:ilvl="0" w:tentative="1">
+      <w:start w:val="1"/>
+      <w:numFmt w:val="decimal"/>
+      <w:lvlText w:val="%1."/>
+      <w:lvlJc w:val="left"/>
+      <w:pPr>
+        <w:ind w:left="540" w:hanging="360"/>
+      </w:pPr>
+    </w:lvl>
+  </w:abstractNum>
+  <w:abstractNum w:abstractNumId="22" w15:restartNumberingAfterBreak="0">
+    <w:multiLevelType w:val="hybridMultilevel"/>
+    <w:lvl w:ilvl="0" w:tentative="1">
+      <w:start w:val="1"/>
+      <w:numFmt w:val="decimal"/>
+      <w:lvlText w:val="%1."/>
+      <w:lvlJc w:val="left"/>
+      <w:pPr>
+        <w:ind w:left="540" w:hanging="360"/>
+      </w:pPr>
+    </w:lvl>
+  </w:abstractNum>
+  <w:abstractNum w:abstractNumId="23" w15:restartNumberingAfterBreak="0">
+    <w:multiLevelType w:val="hybridMultilevel"/>
+    <w:lvl w:ilvl="0" w:tentative="1">
+      <w:start w:val="1"/>
+      <w:numFmt w:val="decimal"/>
+      <w:lvlText w:val="%1."/>
+      <w:lvlJc w:val="left"/>
+      <w:pPr>
+        <w:ind w:left="540" w:hanging="360"/>
+      </w:pPr>
+    </w:lvl>
+  </w:abstractNum>
+  <w:abstractNum w:abstractNumId="24" w15:restartNumberingAfterBreak="0">
+    <w:multiLevelType w:val="hybridMultilevel"/>
+    <w:lvl w:ilvl="0" w:tentative="1">
+      <w:start w:val="1"/>
+      <w:numFmt w:val="decimal"/>
+      <w:lvlText w:val="%1."/>
+      <w:lvlJc w:val="left"/>
+      <w:pPr>
+        <w:ind w:left="540" w:hanging="360"/>
+      </w:pPr>
+    </w:lvl>
+  </w:abstractNum>
+  <w:abstractNum w:abstractNumId="25" w15:restartNumberingAfterBreak="0">
+    <w:multiLevelType w:val="hybridMultilevel"/>
+    <w:lvl w:ilvl="0" w:tentative="1">
+      <w:start w:val="1"/>
+      <w:numFmt w:val="decimal"/>
+      <w:lvlText w:val="%1."/>
+      <w:lvlJc w:val="left"/>
+      <w:pPr>
+        <w:ind w:left="540" w:hanging="360"/>
+      </w:pPr>
+    </w:lvl>
+  </w:abstractNum>
+  <w:abstractNum w:abstractNumId="26" w15:restartNumberingAfterBreak="0">
+    <w:multiLevelType w:val="hybridMultilevel"/>
+    <w:lvl w:ilvl="0" w:tentative="1">
+      <w:start w:val="1"/>
+      <w:numFmt w:val="decimal"/>
+      <w:lvlText w:val="%1."/>
+      <w:lvlJc w:val="left"/>
+      <w:pPr>
+        <w:ind w:left="540" w:hanging="360"/>
+      </w:pPr>
+    </w:lvl>
+  </w:abstractNum>
+  <w:abstractNum w:abstractNumId="27" w15:restartNumberingAfterBreak="0">
+    <w:multiLevelType w:val="hybridMultilevel"/>
+    <w:lvl w:ilvl="0" w:tentative="1">
+      <w:start w:val="1"/>
+      <w:numFmt w:val="decimal"/>
+      <w:lvlText w:val="%1."/>
+      <w:lvlJc w:val="left"/>
+      <w:pPr>
+        <w:ind w:left="540" w:hanging="360"/>
+      </w:pPr>
+    </w:lvl>
+  </w:abstractNum>
+  <w:abstractNum w:abstractNumId="28" w15:restartNumberingAfterBreak="0">
+    <w:multiLevelType w:val="hybridMultilevel"/>
+    <w:lvl w:ilvl="0" w:tentative="1">
+      <w:start w:val="1"/>
+      <w:numFmt w:val="decimal"/>
+      <w:lvlText w:val="%1."/>
+      <w:lvlJc w:val="left"/>
+      <w:pPr>
+        <w:ind w:left="540" w:hanging="360"/>
+      </w:pPr>
+    </w:lvl>
+  </w:abstractNum>
+  <w:abstractNum w:abstractNumId="29" w15:restartNumberingAfterBreak="0">
+    <w:multiLevelType w:val="hybridMultilevel"/>
+    <w:lvl w:ilvl="0" w:tentative="1">
+      <w:start w:val="1"/>
+      <w:numFmt w:val="decimal"/>
+      <w:lvlText w:val="%1."/>
+      <w:lvlJc w:val="left"/>
+      <w:pPr>
+        <w:ind w:left="540" w:hanging="360"/>
+      </w:pPr>
+    </w:lvl>
+  </w:abstractNum>
+  <w:abstractNum w:abstractNumId="30" w15:restartNumberingAfterBreak="0">
+    <w:multiLevelType w:val="hybridMultilevel"/>
+    <w:lvl w:ilvl="0" w:tentative="1">
+      <w:start w:val="1"/>
+      <w:numFmt w:val="decimal"/>
+      <w:lvlText w:val="%1."/>
+      <w:lvlJc w:val="left"/>
+      <w:pPr>
+        <w:ind w:left="540" w:hanging="360"/>
+      </w:pPr>
+    </w:lvl>
+  </w:abstractNum>
+  <w:abstractNum w:abstractNumId="31" w15:restartNumberingAfterBreak="0">
+    <w:multiLevelType w:val="hybridMultilevel"/>
+    <w:lvl w:ilvl="0" w:tentative="1">
+      <w:start w:val="1"/>
+      <w:numFmt w:val="decimal"/>
+      <w:lvlText w:val="%1."/>
+      <w:lvlJc w:val="left"/>
+      <w:pPr>
+        <w:ind w:left="540" w:hanging="360"/>
+      </w:pPr>
+    </w:lvl>
+  </w:abstractNum>
+  <w:abstractNum w:abstractNumId="32" w15:restartNumberingAfterBreak="0">
+    <w:multiLevelType w:val="hybridMultilevel"/>
+    <w:lvl w:ilvl="0" w:tentative="1">
+      <w:start w:val="1"/>
+      <w:numFmt w:val="decimal"/>
+      <w:lvlText w:val="%1."/>
+      <w:lvlJc w:val="left"/>
+      <w:pPr>
+        <w:ind w:left="540" w:hanging="360"/>
+      </w:pPr>
+    </w:lvl>
+  </w:abstractNum>
+  <w:abstractNum w:abstractNumId="33" w15:restartNumberingAfterBreak="0">
+    <w:multiLevelType w:val="hybridMultilevel"/>
+    <w:lvl w:ilvl="0" w:tentative="1">
+      <w:start w:val="1"/>
+      <w:numFmt w:val="decimal"/>
+      <w:lvlText w:val="%1."/>
+      <w:lvlJc w:val="left"/>
+      <w:pPr>
+        <w:ind w:left="540" w:hanging="360"/>
+      </w:pPr>
+    </w:lvl>
+  </w:abstractNum>
+  <w:abstractNum w:abstractNumId="34" w15:restartNumberingAfterBreak="0">
+    <w:multiLevelType w:val="hybridMultilevel"/>
+    <w:lvl w:ilvl="0" w:tentative="1">
+      <w:start w:val="1"/>
+      <w:numFmt w:val="decimal"/>
+      <w:lvlText w:val="%1."/>
+      <w:lvlJc w:val="left"/>
+      <w:pPr>
+        <w:ind w:left="540" w:hanging="360"/>
+      </w:pPr>
+    </w:lvl>
+  </w:abstractNum>
+  <w:abstractNum w:abstractNumId="35" w15:restartNumberingAfterBreak="0">
+    <w:multiLevelType w:val="hybridMultilevel"/>
+    <w:lvl w:ilvl="0" w:tentative="1">
+      <w:start w:val="1"/>
+      <w:numFmt w:val="decimal"/>
+      <w:lvlText w:val="%1."/>
+      <w:lvlJc w:val="left"/>
+      <w:pPr>
+        <w:ind w:left="540" w:hanging="360"/>
+      </w:pPr>
+    </w:lvl>
+  </w:abstractNum>
+  <w:abstractNum w:abstractNumId="36" w15:restartNumberingAfterBreak="0">
+    <w:multiLevelType w:val="hybridMultilevel"/>
+    <w:lvl w:ilvl="0" w:tentative="1">
+      <w:start w:val="1"/>
+      <w:numFmt w:val="decimal"/>
+      <w:lvlText w:val="%1."/>
+      <w:lvlJc w:val="left"/>
+      <w:pPr>
+        <w:ind w:left="540" w:hanging="360"/>
+      </w:pPr>
+    </w:lvl>
+  </w:abstractNum>
+  <w:abstractNum w:abstractNumId="37" w15:restartNumberingAfterBreak="0">
+    <w:multiLevelType w:val="hybridMultilevel"/>
+    <w:lvl w:ilvl="0" w:tentative="1">
+      <w:start w:val="1"/>
+      <w:numFmt w:val="decimal"/>
+      <w:lvlText w:val="%1."/>
+      <w:lvlJc w:val="left"/>
+      <w:pPr>
+        <w:ind w:left="540" w:hanging="360"/>
+      </w:pPr>
+    </w:lvl>
+  </w:abstractNum>
+  <w:abstractNum w:abstractNumId="38" w15:restartNumberingAfterBreak="0">
+    <w:multiLevelType w:val="hybridMultilevel"/>
+    <w:lvl w:ilvl="0" w:tentative="1">
+      <w:start w:val="1"/>
+      <w:numFmt w:val="decimal"/>
+      <w:lvlText w:val="%1."/>
+      <w:lvlJc w:val="left"/>
+      <w:pPr>
+        <w:ind w:left="540" w:hanging="360"/>
+      </w:pPr>
+    </w:lvl>
+  </w:abstractNum>
+  <w:abstractNum w:abstractNumId="39" w15:restartNumberingAfterBreak="0">
+    <w:multiLevelType w:val="hybridMultilevel"/>
+    <w:lvl w:ilvl="0" w:tentative="1">
+      <w:start w:val="1"/>
+      <w:numFmt w:val="decimal"/>
+      <w:lvlText w:val="%1."/>
+      <w:lvlJc w:val="left"/>
+      <w:pPr>
+        <w:ind w:left="540" w:hanging="360"/>
+      </w:pPr>
+    </w:lvl>
+  </w:abstractNum>
+  <w:abstractNum w:abstractNumId="40" w15:restartNumberingAfterBreak="0">
+    <w:multiLevelType w:val="hybridMultilevel"/>
+    <w:lvl w:ilvl="0" w:tentative="1">
+      <w:start w:val="1"/>
+      <w:numFmt w:val="decimal"/>
+      <w:lvlText w:val="%1."/>
+      <w:lvlJc w:val="left"/>
+      <w:pPr>
+        <w:ind w:left="540" w:hanging="360"/>
+      </w:pPr>
+    </w:lvl>
+  </w:abstractNum>
+  <w:abstractNum w:abstractNumId="41" w15:restartNumberingAfterBreak="0">
+    <w:multiLevelType w:val="hybridMultilevel"/>
+    <w:lvl w:ilvl="0" w:tentative="1">
+      <w:start w:val="1"/>
+      <w:numFmt w:val="decimal"/>
+      <w:lvlText w:val="%1."/>
+      <w:lvlJc w:val="left"/>
+      <w:pPr>
+        <w:ind w:left="540" w:hanging="360"/>
+      </w:pPr>
+    </w:lvl>
+  </w:abstractNum>
+  <w:abstractNum w:abstractNumId="42" w15:restartNumberingAfterBreak="0">
+    <w:multiLevelType w:val="hybridMultilevel"/>
+    <w:lvl w:ilvl="0" w:tentative="1">
+      <w:start w:val="1"/>
+      <w:numFmt w:val="decimal"/>
+      <w:lvlText w:val="%1."/>
+      <w:lvlJc w:val="left"/>
+      <w:pPr>
+        <w:ind w:left="540" w:hanging="360"/>
+      </w:pPr>
+    </w:lvl>
+  </w:abstractNum>
+  <w:abstractNum w:abstractNumId="43" w15:restartNumberingAfterBreak="0">
+    <w:multiLevelType w:val="hybridMultilevel"/>
+    <w:lvl w:ilvl="0" w:tentative="1">
+      <w:start w:val="1"/>
+      <w:numFmt w:val="decimal"/>
+      <w:lvlText w:val="%1."/>
+      <w:lvlJc w:val="left"/>
+      <w:pPr>
+        <w:ind w:left="540" w:hanging="360"/>
+      </w:pPr>
+    </w:lvl>
+  </w:abstractNum>
+  <w:abstractNum w:abstractNumId="44" w15:restartNumberingAfterBreak="0">
+    <w:multiLevelType w:val="hybridMultilevel"/>
+    <w:lvl w:ilvl="0" w:tentative="1">
+      <w:start w:val="1"/>
+      <w:numFmt w:val="decimal"/>
+      <w:lvlText w:val="%1."/>
+      <w:lvlJc w:val="left"/>
+      <w:pPr>
+        <w:ind w:left="540" w:hanging="360"/>
+      </w:pPr>
+    </w:lvl>
+  </w:abstractNum>
+  <w:abstractNum w:abstractNumId="45" w15:restartNumberingAfterBreak="0">
+    <w:multiLevelType w:val="hybridMultilevel"/>
+    <w:lvl w:ilvl="0" w:tentative="1">
+      <w:start w:val="1"/>
+      <w:numFmt w:val="decimal"/>
+      <w:lvlText w:val="%1."/>
+      <w:lvlJc w:val="left"/>
+      <w:pPr>
+        <w:ind w:left="540" w:hanging="360"/>
+      </w:pPr>
+    </w:lvl>
+  </w:abstractNum>
+  <w:abstractNum w:abstractNumId="46" w15:restartNumberingAfterBreak="0">
+    <w:multiLevelType w:val="hybridMultilevel"/>
+    <w:lvl w:ilvl="0" w:tentative="1">
+      <w:start w:val="1"/>
+      <w:numFmt w:val="decimal"/>
+      <w:lvlText w:val="%1."/>
+      <w:lvlJc w:val="left"/>
+      <w:pPr>
+        <w:ind w:left="540" w:hanging="360"/>
+      </w:pPr>
+    </w:lvl>
+  </w:abstractNum>
+  <w:abstractNum w:abstractNumId="47" w15:restartNumberingAfterBreak="0">
+    <w:multiLevelType w:val="hybridMultilevel"/>
+    <w:lvl w:ilvl="0" w:tentative="1">
+      <w:start w:val="1"/>
+      <w:numFmt w:val="decimal"/>
+      <w:lvlText w:val="%1."/>
+      <w:lvlJc w:val="left"/>
+      <w:pPr>
+        <w:ind w:left="540" w:hanging="360"/>
+      </w:pPr>
+    </w:lvl>
+  </w:abstractNum>
+  <w:abstractNum w:abstractNumId="48" w15:restartNumberingAfterBreak="0">
+    <w:multiLevelType w:val="hybridMultilevel"/>
+    <w:lvl w:ilvl="0" w:tentative="1">
+      <w:start w:val="1"/>
+      <w:numFmt w:val="decimal"/>
+      <w:lvlText w:val="%1."/>
+      <w:lvlJc w:val="left"/>
+      <w:pPr>
+        <w:ind w:left="540" w:hanging="360"/>
+      </w:pPr>
+    </w:lvl>
+  </w:abstractNum>
+  <w:abstractNum w:abstractNumId="49" w15:restartNumberingAfterBreak="0">
+    <w:multiLevelType w:val="hybridMultilevel"/>
+    <w:lvl w:ilvl="0" w:tentative="1">
+      <w:start w:val="1"/>
+      <w:numFmt w:val="decimal"/>
+      <w:lvlText w:val="%1."/>
+      <w:lvlJc w:val="left"/>
+      <w:pPr>
+        <w:ind w:left="540" w:hanging="360"/>
+      </w:pPr>
+    </w:lvl>
+  </w:abstractNum>
+  <w:abstractNum w:abstractNumId="50" w15:restartNumberingAfterBreak="0">
+    <w:multiLevelType w:val="hybridMultilevel"/>
+    <w:lvl w:ilvl="0" w:tentative="1">
+      <w:start w:val="1"/>
+      <w:numFmt w:val="decimal"/>
+      <w:lvlText w:val="%1."/>
+      <w:lvlJc w:val="left"/>
+      <w:pPr>
+        <w:ind w:left="540" w:hanging="360"/>
+      </w:pPr>
+    </w:lvl>
+  </w:abstractNum>
+  <w:abstractNum w:abstractNumId="51" w15:restartNumberingAfterBreak="0">
+    <w:multiLevelType w:val="hybridMultilevel"/>
+    <w:lvl w:ilvl="0" w:tentative="1">
+      <w:start w:val="1"/>
+      <w:numFmt w:val="decimal"/>
+      <w:lvlText w:val="%1."/>
+      <w:lvlJc w:val="left"/>
+      <w:pPr>
+        <w:ind w:left="540" w:hanging="360"/>
+      </w:pPr>
+    </w:lvl>
+  </w:abstractNum>
+  <w:abstractNum w:abstractNumId="52" w15:restartNumberingAfterBreak="0">
+    <w:multiLevelType w:val="hybridMultilevel"/>
+    <w:lvl w:ilvl="0" w:tentative="1">
+      <w:start w:val="1"/>
+      <w:numFmt w:val="decimal"/>
+      <w:lvlText w:val="%1."/>
+      <w:lvlJc w:val="left"/>
+      <w:pPr>
+        <w:ind w:left="540" w:hanging="360"/>
+      </w:pPr>
+    </w:lvl>
+  </w:abstractNum>
+  <w:abstractNum w:abstractNumId="53" w15:restartNumberingAfterBreak="0">
+    <w:multiLevelType w:val="hybridMultilevel"/>
+    <w:lvl w:ilvl="0" w:tentative="1">
+      <w:start w:val="1"/>
+      <w:numFmt w:val="decimal"/>
+      <w:lvlText w:val="%1."/>
+      <w:lvlJc w:val="left"/>
+      <w:pPr>
+        <w:ind w:left="540" w:hanging="360"/>
+      </w:pPr>
+    </w:lvl>
+  </w:abstractNum>
+  <w:abstractNum w:abstractNumId="54" w15:restartNumberingAfterBreak="0">
+    <w:multiLevelType w:val="hybridMultilevel"/>
+    <w:lvl w:ilvl="0" w:tentative="1">
+      <w:start w:val="1"/>
+      <w:numFmt w:val="decimal"/>
+      <w:lvlText w:val="%1."/>
+      <w:lvlJc w:val="left"/>
+      <w:pPr>
+        <w:ind w:left="540" w:hanging="360"/>
+      </w:pPr>
+    </w:lvl>
+  </w:abstractNum>
+  <w:abstractNum w:abstractNumId="55" w15:restartNumberingAfterBreak="0">
+    <w:multiLevelType w:val="hybridMultilevel"/>
+    <w:lvl w:ilvl="0" w:tentative="1">
+      <w:start w:val="1"/>
+      <w:numFmt w:val="decimal"/>
+      <w:lvlText w:val="%1."/>
+      <w:lvlJc w:val="left"/>
+      <w:pPr>
+        <w:ind w:left="540" w:hanging="360"/>
+      </w:pPr>
+    </w:lvl>
+  </w:abstractNum>
+  <w:abstractNum w:abstractNumId="56" w15:restartNumberingAfterBreak="0">
+    <w:multiLevelType w:val="hybridMultilevel"/>
+    <w:lvl w:ilvl="0" w:tentative="1">
+      <w:start w:val="1"/>
+      <w:numFmt w:val="decimal"/>
+      <w:lvlText w:val="%1."/>
+      <w:lvlJc w:val="left"/>
+      <w:pPr>
+        <w:ind w:left="540" w:hanging="360"/>
+      </w:pPr>
+    </w:lvl>
+  </w:abstractNum>
+  <w:abstractNum w:abstractNumId="57" w15:restartNumberingAfterBreak="0">
+    <w:multiLevelType w:val="hybridMultilevel"/>
+    <w:lvl w:ilvl="0" w:tentative="1">
+      <w:start w:val="1"/>
+      <w:numFmt w:val="decimal"/>
+      <w:lvlText w:val="%1."/>
+      <w:lvlJc w:val="left"/>
+      <w:pPr>
+        <w:ind w:left="540" w:hanging="360"/>
+      </w:pPr>
+    </w:lvl>
+  </w:abstractNum>
+  <w:abstractNum w:abstractNumId="58" w15:restartNumberingAfterBreak="0">
+    <w:multiLevelType w:val="hybridMultilevel"/>
+    <w:lvl w:ilvl="0" w:tentative="1">
+      <w:start w:val="1"/>
+      <w:numFmt w:val="decimal"/>
+      <w:lvlText w:val="%1."/>
+      <w:lvlJc w:val="left"/>
+      <w:pPr>
+        <w:ind w:left="540" w:hanging="360"/>
+      </w:pPr>
+    </w:lvl>
+  </w:abstractNum>
+  <w:abstractNum w:abstractNumId="59" w15:restartNumberingAfterBreak="0">
+    <w:multiLevelType w:val="hybridMultilevel"/>
+    <w:lvl w:ilvl="0" w:tentative="1">
+      <w:start w:val="1"/>
+      <w:numFmt w:val="decimal"/>
+      <w:lvlText w:val="%1."/>
+      <w:lvlJc w:val="left"/>
+      <w:pPr>
+        <w:ind w:left="540" w:hanging="360"/>
+      </w:pPr>
+    </w:lvl>
+  </w:abstractNum>
+  <w:abstractNum w:abstractNumId="60" w15:restartNumberingAfterBreak="0">
+    <w:multiLevelType w:val="hybridMultilevel"/>
+    <w:lvl w:ilvl="0" w:tentative="1">
+      <w:start w:val="1"/>
+      <w:numFmt w:val="decimal"/>
+      <w:lvlText w:val="%1."/>
+      <w:lvlJc w:val="left"/>
+      <w:pPr>
+        <w:ind w:left="540" w:hanging="360"/>
+      </w:pPr>
+    </w:lvl>
+  </w:abstractNum>
+  <w:abstractNum w:abstractNumId="61" w15:restartNumberingAfterBreak="0">
+    <w:multiLevelType w:val="hybridMultilevel"/>
+    <w:lvl w:ilvl="0" w:tentative="1">
+      <w:start w:val="1"/>
+      <w:numFmt w:val="decimal"/>
+      <w:lvlText w:val="%1."/>
+      <w:lvlJc w:val="left"/>
+      <w:pPr>
+        <w:ind w:left="540" w:hanging="360"/>
+      </w:pPr>
+    </w:lvl>
+  </w:abstractNum>
+  <w:abstractNum w:abstractNumId="62" w15:restartNumberingAfterBreak="0">
+    <w:multiLevelType w:val="hybridMultilevel"/>
+    <w:lvl w:ilvl="0" w:tentative="1">
+      <w:start w:val="1"/>
+      <w:numFmt w:val="decimal"/>
+      <w:lvlText w:val="%1."/>
+      <w:lvlJc w:val="left"/>
+      <w:pPr>
+        <w:ind w:left="540" w:hanging="360"/>
+      </w:pPr>
+    </w:lvl>
+  </w:abstractNum>
+  <w:abstractNum w:abstractNumId="63" w15:restartNumberingAfterBreak="0">
+    <w:multiLevelType w:val="hybridMultilevel"/>
+    <w:lvl w:ilvl="0" w:tentative="1">
+      <w:start w:val="1"/>
+      <w:numFmt w:val="decimal"/>
+      <w:lvlText w:val="%1."/>
+      <w:lvlJc w:val="left"/>
+      <w:pPr>
+        <w:ind w:left="540" w:hanging="360"/>
+      </w:pPr>
+    </w:lvl>
+  </w:abstractNum>
+  <w:abstractNum w:abstractNumId="64" w15:restartNumberingAfterBreak="0">
+    <w:multiLevelType w:val="hybridMultilevel"/>
+    <w:lvl w:ilvl="0" w:tentative="1">
+      <w:start w:val="1"/>
+      <w:numFmt w:val="decimal"/>
+      <w:lvlText w:val="%1."/>
+      <w:lvlJc w:val="left"/>
+      <w:pPr>
+        <w:ind w:left="540" w:hanging="360"/>
+      </w:pPr>
+    </w:lvl>
+  </w:abstractNum>
+  <w:abstractNum w:abstractNumId="65" w15:restartNumberingAfterBreak="0">
+    <w:multiLevelType w:val="hybridMultilevel"/>
+    <w:lvl w:ilvl="0" w:tentative="1">
+      <w:start w:val="1"/>
+      <w:numFmt w:val="decimal"/>
+      <w:lvlText w:val="%1."/>
+      <w:lvlJc w:val="left"/>
+      <w:pPr>
+        <w:ind w:left="540" w:hanging="360"/>
+      </w:pPr>
+    </w:lvl>
+  </w:abstractNum>
+  <w:abstractNum w:abstractNumId="66" w15:restartNumberingAfterBreak="0">
+    <w:multiLevelType w:val="hybridMultilevel"/>
+    <w:lvl w:ilvl="0" w:tentative="1">
+      <w:start w:val="1"/>
+      <w:numFmt w:val="decimal"/>
+      <w:lvlText w:val="%1."/>
+      <w:lvlJc w:val="left"/>
+      <w:pPr>
+        <w:ind w:left="540" w:hanging="360"/>
+      </w:pPr>
+    </w:lvl>
+  </w:abstractNum>
+  <w:abstractNum w:abstractNumId="67" w15:restartNumberingAfterBreak="0">
+    <w:multiLevelType w:val="hybridMultilevel"/>
+    <w:lvl w:ilvl="0" w:tentative="1">
+      <w:start w:val="1"/>
+      <w:numFmt w:val="decimal"/>
+      <w:lvlText w:val="%1."/>
+      <w:lvlJc w:val="left"/>
+      <w:pPr>
+        <w:ind w:left="540" w:hanging="360"/>
+      </w:pPr>
+    </w:lvl>
+  </w:abstractNum>
+  <w:abstractNum w:abstractNumId="68" w15:restartNumberingAfterBreak="0">
+    <w:multiLevelType w:val="hybridMultilevel"/>
+    <w:lvl w:ilvl="0" w:tentative="1">
+      <w:start w:val="1"/>
+      <w:numFmt w:val="decimal"/>
+      <w:lvlText w:val="%1."/>
+      <w:lvlJc w:val="left"/>
+      <w:pPr>
+        <w:ind w:left="540" w:hanging="360"/>
+      </w:pPr>
+    </w:lvl>
+  </w:abstractNum>
+  <w:abstractNum w:abstractNumId="69" w15:restartNumberingAfterBreak="0">
+    <w:multiLevelType w:val="hybridMultilevel"/>
+    <w:lvl w:ilvl="0" w:tentative="1">
+      <w:start w:val="1"/>
+      <w:numFmt w:val="decimal"/>
+      <w:lvlText w:val="%1."/>
+      <w:lvlJc w:val="left"/>
+      <w:pPr>
+        <w:ind w:left="540" w:hanging="360"/>
+      </w:pPr>
+    </w:lvl>
+  </w:abstractNum>
+  <w:abstractNum w:abstractNumId="70" w15:restartNumberingAfterBreak="0">
+    <w:multiLevelType w:val="hybridMultilevel"/>
+    <w:lvl w:ilvl="0" w:tentative="1">
+      <w:start w:val="1"/>
+      <w:numFmt w:val="decimal"/>
+      <w:lvlText w:val="%1."/>
+      <w:lvlJc w:val="left"/>
+      <w:pPr>
+        <w:ind w:left="540" w:hanging="360"/>
+      </w:pPr>
+    </w:lvl>
+  </w:abstractNum>
+  <w:abstractNum w:abstractNumId="71" w15:restartNumberingAfterBreak="0">
+    <w:multiLevelType w:val="hybridMultilevel"/>
+    <w:lvl w:ilvl="0" w:tentative="1">
+      <w:start w:val="1"/>
+      <w:numFmt w:val="decimal"/>
+      <w:lvlText w:val="%1."/>
+      <w:lvlJc w:val="left"/>
+      <w:pPr>
+        <w:ind w:left="540" w:hanging="360"/>
+      </w:pPr>
+    </w:lvl>
+  </w:abstractNum>
+  <w:abstractNum w:abstractNumId="72" w15:restartNumberingAfterBreak="0">
+    <w:multiLevelType w:val="hybridMultilevel"/>
+    <w:lvl w:ilvl="0" w:tentative="1">
+      <w:start w:val="1"/>
+      <w:numFmt w:val="decimal"/>
+      <w:lvlText w:val="%1."/>
+      <w:lvlJc w:val="left"/>
+      <w:pPr>
+        <w:ind w:left="540" w:hanging="360"/>
+      </w:pPr>
+    </w:lvl>
+  </w:abstractNum>
+  <w:abstractNum w:abstractNumId="73" w15:restartNumberingAfterBreak="0">
+    <w:multiLevelType w:val="hybridMultilevel"/>
+    <w:lvl w:ilvl="0" w:tentative="1">
+      <w:start w:val="1"/>
+      <w:numFmt w:val="decimal"/>
+      <w:lvlText w:val="%1."/>
+      <w:lvlJc w:val="left"/>
+      <w:pPr>
+        <w:ind w:left="540" w:hanging="360"/>
+      </w:pPr>
+    </w:lvl>
+  </w:abstractNum>
+  <w:abstractNum w:abstractNumId="74" w15:restartNumberingAfterBreak="0">
+    <w:multiLevelType w:val="hybridMultilevel"/>
+    <w:lvl w:ilvl="0" w:tentative="1">
+      <w:start w:val="1"/>
+      <w:numFmt w:val="decimal"/>
+      <w:lvlText w:val="%1."/>
+      <w:lvlJc w:val="left"/>
+      <w:pPr>
+        <w:ind w:left="540" w:hanging="360"/>
+      </w:pPr>
+    </w:lvl>
+  </w:abstractNum>
+  <w:abstractNum w:abstractNumId="75" w15:restartNumberingAfterBreak="0">
+    <w:multiLevelType w:val="hybridMultilevel"/>
+    <w:lvl w:ilvl="0" w:tentative="1">
+      <w:start w:val="1"/>
+      <w:numFmt w:val="decimal"/>
+      <w:lvlText w:val="%1."/>
+      <w:lvlJc w:val="left"/>
+      <w:pPr>
+        <w:ind w:left="540" w:hanging="360"/>
+      </w:pPr>
+    </w:lvl>
+  </w:abstractNum>
+  <w:abstractNum w:abstractNumId="76" w15:restartNumberingAfterBreak="0">
+    <w:multiLevelType w:val="hybridMultilevel"/>
+    <w:lvl w:ilvl="0" w:tentative="1">
+      <w:start w:val="1"/>
+      <w:numFmt w:val="decimal"/>
+      <w:lvlText w:val="%1."/>
+      <w:lvlJc w:val="left"/>
+      <w:pPr>
+        <w:ind w:left="540" w:hanging="360"/>
+      </w:pPr>
+    </w:lvl>
+  </w:abstractNum>
+  <w:abstractNum w:abstractNumId="77" w15:restartNumberingAfterBreak="0">
+    <w:multiLevelType w:val="hybridMultilevel"/>
+    <w:lvl w:ilvl="0" w:tentative="1">
+      <w:start w:val="1"/>
+      <w:numFmt w:val="decimal"/>
+      <w:lvlText w:val="%1."/>
+      <w:lvlJc w:val="left"/>
+      <w:pPr>
+        <w:ind w:left="540" w:hanging="360"/>
+      </w:pPr>
+    </w:lvl>
+  </w:abstractNum>
+  <w:abstractNum w:abstractNumId="78" w15:restartNumberingAfterBreak="0">
+    <w:multiLevelType w:val="hybridMultilevel"/>
+    <w:lvl w:ilvl="0" w:tentative="1">
+      <w:start w:val="1"/>
+      <w:numFmt w:val="decimal"/>
+      <w:lvlText w:val="%1."/>
+      <w:lvlJc w:val="left"/>
+      <w:pPr>
+        <w:ind w:left="540" w:hanging="360"/>
+      </w:pPr>
+    </w:lvl>
+  </w:abstractNum>
+  <w:abstractNum w:abstractNumId="79" w15:restartNumberingAfterBreak="0">
+    <w:multiLevelType w:val="hybridMultilevel"/>
+    <w:lvl w:ilvl="0" w:tentative="1">
+      <w:start w:val="1"/>
+      <w:numFmt w:val="decimal"/>
+      <w:lvlText w:val="%1."/>
+      <w:lvlJc w:val="left"/>
+      <w:pPr>
+        <w:ind w:left="540" w:hanging="360"/>
+      </w:pPr>
+    </w:lvl>
+  </w:abstractNum>
+  <w:abstractNum w:abstractNumId="80" w15:restartNumberingAfterBreak="0">
+    <w:multiLevelType w:val="hybridMultilevel"/>
+    <w:lvl w:ilvl="0" w:tentative="1">
+      <w:start w:val="1"/>
+      <w:numFmt w:val="decimal"/>
+      <w:lvlText w:val="%1."/>
+      <w:lvlJc w:val="left"/>
+      <w:pPr>
+        <w:ind w:left="540" w:hanging="360"/>
+      </w:pPr>
+    </w:lvl>
+  </w:abstractNum>
+  <w:abstractNum w:abstractNumId="81" w15:restartNumberingAfterBreak="0">
+    <w:multiLevelType w:val="hybridMultilevel"/>
+    <w:lvl w:ilvl="0" w:tentative="1">
+      <w:start w:val="1"/>
+      <w:numFmt w:val="decimal"/>
+      <w:lvlText w:val="%1."/>
+      <w:lvlJc w:val="left"/>
+      <w:pPr>
+        <w:ind w:left="540" w:hanging="360"/>
+      </w:pPr>
+    </w:lvl>
+  </w:abstractNum>
+  <w:abstractNum w:abstractNumId="82" w15:restartNumberingAfterBreak="0">
+    <w:multiLevelType w:val="hybridMultilevel"/>
+    <w:lvl w:ilvl="0" w:tentative="1">
+      <w:start w:val="1"/>
+      <w:numFmt w:val="decimal"/>
+      <w:lvlText w:val="%1."/>
+      <w:lvlJc w:val="left"/>
+      <w:pPr>
+        <w:ind w:left="540" w:hanging="360"/>
+      </w:pPr>
+    </w:lvl>
+  </w:abstractNum>
   <w:num w:numId="1">
     <w:abstractNumId w:val="1"/>
     <w:lvlOverride w:ilvl="0">
@@ -2418,13 +3366,19 @@
     </w:lvlOverride>
   </w:num>
   <w:num w:numId="2">
-    <w:abstractNumId w:val="3"/>
+    <w:abstractNumId w:val="15"/>
     <w:lvlOverride w:ilvl="0">
       <w:startOverride w:val="1"/>
     </w:lvlOverride>
   </w:num>
   <w:num w:numId="3">
     <w:abstractNumId w:val="2"/>
+    <w:lvlOverride w:ilvl="0">
+      <w:startOverride w:val="1"/>
+    </w:lvlOverride>
+  </w:num>
+  <w:num w:numId="4">
+    <w:abstractNumId w:val="22"/>
     <w:lvlOverride w:ilvl="0">
       <w:startOverride w:val="1"/>
     </w:lvlOverride>

</xml_diff>

<commit_message>
Selectable AI provider (Claude/Groq/Gemini) with fallback chain across all three services
- LLM_PROVIDER / LLM_FALLBACK settings, provider chain, offline fallback if all fail
- repo-root .env loaded by every service; *_BASE_URL overrides
- provider:model syntax for evaluation harnesses; cost/token reporting fixed in Task 1 eval
- tests no longer write repo files; 27 new tests; docs and Word guides updated

Co-Authored-By: Claude Sonnet 5.5 <noreply@anthropic.com>
</commit_message>
<xml_diff>
--- a/docs/Project_Explainer.docx
+++ b/docs/Project_Explainer.docx
@@ -1363,6 +1363,98 @@
           </w:p>
         </w:tc>
       </w:tr>
+      <w:tr>
+        <w:trPr>
+          <w:cantSplit/>
+        </w:trPr>
+        <w:tc>
+          <w:tcPr>
+            <w:tcW w:type="dxa" w:w="2500"/>
+            <w:tcBorders>
+              <w:top w:val="single" w:color="BFBFBF" w:sz="4"/>
+              <w:left w:val="single" w:color="BFBFBF" w:sz="4"/>
+              <w:bottom w:val="single" w:color="BFBFBF" w:sz="4"/>
+              <w:right w:val="single" w:color="BFBFBF" w:sz="4"/>
+            </w:tcBorders>
+            <w:tcMar>
+              <w:top w:type="dxa" w:w="70"/>
+              <w:left w:type="dxa" w:w="110"/>
+              <w:bottom w:type="dxa" w:w="70"/>
+              <w:right w:type="dxa" w:w="110"/>
+            </w:tcMar>
+          </w:tcPr>
+          <w:p>
+            <w:r>
+              <w:rPr>
+                <w:rFonts w:ascii="Calibri" w:cs="Calibri" w:eastAsia="Calibri" w:hAnsi="Calibri"/>
+                <w:b w:val="false"/>
+                <w:bCs w:val="false"/>
+                <w:sz w:val="20"/>
+                <w:szCs w:val="20"/>
+              </w:rPr>
+              <w:t xml:space="preserve">AI provider is a setting with an automatic fallback chain</w:t>
+            </w:r>
+          </w:p>
+        </w:tc>
+        <w:tc>
+          <w:tcPr>
+            <w:tcW w:type="dxa" w:w="3300"/>
+            <w:tcBorders>
+              <w:top w:val="single" w:color="BFBFBF" w:sz="4"/>
+              <w:left w:val="single" w:color="BFBFBF" w:sz="4"/>
+              <w:bottom w:val="single" w:color="BFBFBF" w:sz="4"/>
+              <w:right w:val="single" w:color="BFBFBF" w:sz="4"/>
+            </w:tcBorders>
+            <w:tcMar>
+              <w:top w:type="dxa" w:w="70"/>
+              <w:left w:type="dxa" w:w="110"/>
+              <w:bottom w:type="dxa" w:w="70"/>
+              <w:right w:type="dxa" w:w="110"/>
+            </w:tcMar>
+          </w:tcPr>
+          <w:p>
+            <w:r>
+              <w:rPr>
+                <w:rFonts w:ascii="Calibri" w:cs="Calibri" w:eastAsia="Calibri" w:hAnsi="Calibri"/>
+                <w:b w:val="false"/>
+                <w:bCs w:val="false"/>
+                <w:sz w:val="20"/>
+                <w:szCs w:val="20"/>
+              </w:rPr>
+              <w:t xml:space="preserve">Claude is the intended model, free Groq or Gemini keys can be used while developing, and a rate limit or outage must not stop the system</w:t>
+            </w:r>
+          </w:p>
+        </w:tc>
+        <w:tc>
+          <w:tcPr>
+            <w:tcW w:type="dxa" w:w="3226"/>
+            <w:tcBorders>
+              <w:top w:val="single" w:color="BFBFBF" w:sz="4"/>
+              <w:left w:val="single" w:color="BFBFBF" w:sz="4"/>
+              <w:bottom w:val="single" w:color="BFBFBF" w:sz="4"/>
+              <w:right w:val="single" w:color="BFBFBF" w:sz="4"/>
+            </w:tcBorders>
+            <w:tcMar>
+              <w:top w:type="dxa" w:w="70"/>
+              <w:left w:type="dxa" w:w="110"/>
+              <w:bottom w:type="dxa" w:w="70"/>
+              <w:right w:type="dxa" w:w="110"/>
+            </w:tcMar>
+          </w:tcPr>
+          <w:p>
+            <w:r>
+              <w:rPr>
+                <w:rFonts w:ascii="Calibri" w:cs="Calibri" w:eastAsia="Calibri" w:hAnsi="Calibri"/>
+                <w:b w:val="false"/>
+                <w:bCs w:val="false"/>
+                <w:sz w:val="20"/>
+                <w:szCs w:val="20"/>
+              </w:rPr>
+              <w:t xml:space="preserve">Free-tier models differ in quality and JSON reliability; use Claude for the final results</w:t>
+            </w:r>
+          </w:p>
+        </w:tc>
+      </w:tr>
     </w:tbl>
     <w:p>
       <w:pPr>
@@ -1605,7 +1697,7 @@
         <w:rPr>
           <w:rFonts w:ascii="Calibri" w:cs="Calibri" w:eastAsia="Calibri" w:hAnsi="Calibri"/>
         </w:rPr>
-        <w:t xml:space="preserve">The Claude model comparison: no API key was available, so every measurement is the offline fallback.</w:t>
+        <w:t xml:space="preserve">The Claude model comparison: no API key was available, so every measurement is the offline fallback. The Groq and Gemini providers are tested with stand-in servers only, not the real services.</w:t>
       </w:r>
     </w:p>
     <w:p>
@@ -1838,6 +1930,132 @@
                 <w:szCs w:val="20"/>
               </w:rPr>
               <w:t xml:space="preserve">Scale and operations cost: one transactional file was enough for ~10,000 chunks, and the index is behind one class so embeddings can be added.</w:t>
+            </w:r>
+          </w:p>
+        </w:tc>
+      </w:tr>
+      <w:tr>
+        <w:trPr>
+          <w:cantSplit/>
+        </w:trPr>
+        <w:tc>
+          <w:tcPr>
+            <w:tcW w:type="dxa" w:w="3000"/>
+            <w:tcBorders>
+              <w:top w:val="single" w:color="BFBFBF" w:sz="4"/>
+              <w:left w:val="single" w:color="BFBFBF" w:sz="4"/>
+              <w:bottom w:val="single" w:color="BFBFBF" w:sz="4"/>
+              <w:right w:val="single" w:color="BFBFBF" w:sz="4"/>
+            </w:tcBorders>
+            <w:tcMar>
+              <w:top w:type="dxa" w:w="70"/>
+              <w:left w:type="dxa" w:w="110"/>
+              <w:bottom w:type="dxa" w:w="70"/>
+              <w:right w:type="dxa" w:w="110"/>
+            </w:tcMar>
+          </w:tcPr>
+          <w:p>
+            <w:r>
+              <w:rPr>
+                <w:rFonts w:ascii="Calibri" w:cs="Calibri" w:eastAsia="Calibri" w:hAnsi="Calibri"/>
+                <w:b w:val="false"/>
+                <w:bCs w:val="false"/>
+                <w:sz w:val="20"/>
+                <w:szCs w:val="20"/>
+              </w:rPr>
+              <w:t xml:space="preserve">What if the AI provider is rate limited or down?</w:t>
+            </w:r>
+          </w:p>
+        </w:tc>
+        <w:tc>
+          <w:tcPr>
+            <w:tcW w:type="dxa" w:w="6026"/>
+            <w:tcBorders>
+              <w:top w:val="single" w:color="BFBFBF" w:sz="4"/>
+              <w:left w:val="single" w:color="BFBFBF" w:sz="4"/>
+              <w:bottom w:val="single" w:color="BFBFBF" w:sz="4"/>
+              <w:right w:val="single" w:color="BFBFBF" w:sz="4"/>
+            </w:tcBorders>
+            <w:tcMar>
+              <w:top w:type="dxa" w:w="70"/>
+              <w:left w:type="dxa" w:w="110"/>
+              <w:bottom w:type="dxa" w:w="70"/>
+              <w:right w:type="dxa" w:w="110"/>
+            </w:tcMar>
+          </w:tcPr>
+          <w:p>
+            <w:r>
+              <w:rPr>
+                <w:rFonts w:ascii="Calibri" w:cs="Calibri" w:eastAsia="Calibri" w:hAnsi="Calibri"/>
+                <w:b w:val="false"/>
+                <w:bCs w:val="false"/>
+                <w:sz w:val="20"/>
+                <w:szCs w:val="20"/>
+              </w:rPr>
+              <w:t xml:space="preserve">The call moves to the next provider in the chain; if all fail, each service uses its built-in offline method. Every answer records which provider produced it, and /health shows the chain.</w:t>
+            </w:r>
+          </w:p>
+        </w:tc>
+      </w:tr>
+      <w:tr>
+        <w:trPr>
+          <w:cantSplit/>
+        </w:trPr>
+        <w:tc>
+          <w:tcPr>
+            <w:tcW w:type="dxa" w:w="3000"/>
+            <w:tcBorders>
+              <w:top w:val="single" w:color="BFBFBF" w:sz="4"/>
+              <w:left w:val="single" w:color="BFBFBF" w:sz="4"/>
+              <w:bottom w:val="single" w:color="BFBFBF" w:sz="4"/>
+              <w:right w:val="single" w:color="BFBFBF" w:sz="4"/>
+            </w:tcBorders>
+            <w:tcMar>
+              <w:top w:type="dxa" w:w="70"/>
+              <w:left w:type="dxa" w:w="110"/>
+              <w:bottom w:type="dxa" w:w="70"/>
+              <w:right w:type="dxa" w:w="110"/>
+            </w:tcMar>
+          </w:tcPr>
+          <w:p>
+            <w:r>
+              <w:rPr>
+                <w:rFonts w:ascii="Calibri" w:cs="Calibri" w:eastAsia="Calibri" w:hAnsi="Calibri"/>
+                <w:b w:val="false"/>
+                <w:bCs w:val="false"/>
+                <w:sz w:val="20"/>
+                <w:szCs w:val="20"/>
+              </w:rPr>
+              <w:t xml:space="preserve">Can you use Gemini or Groq instead of Claude?</w:t>
+            </w:r>
+          </w:p>
+        </w:tc>
+        <w:tc>
+          <w:tcPr>
+            <w:tcW w:type="dxa" w:w="6026"/>
+            <w:tcBorders>
+              <w:top w:val="single" w:color="BFBFBF" w:sz="4"/>
+              <w:left w:val="single" w:color="BFBFBF" w:sz="4"/>
+              <w:bottom w:val="single" w:color="BFBFBF" w:sz="4"/>
+              <w:right w:val="single" w:color="BFBFBF" w:sz="4"/>
+            </w:tcBorders>
+            <w:tcMar>
+              <w:top w:type="dxa" w:w="70"/>
+              <w:left w:type="dxa" w:w="110"/>
+              <w:bottom w:type="dxa" w:w="70"/>
+              <w:right w:type="dxa" w:w="110"/>
+            </w:tcMar>
+          </w:tcPr>
+          <w:p>
+            <w:r>
+              <w:rPr>
+                <w:rFonts w:ascii="Calibri" w:cs="Calibri" w:eastAsia="Calibri" w:hAnsi="Calibri"/>
+                <w:b w:val="false"/>
+                <w:bCs w:val="false"/>
+                <w:sz w:val="20"/>
+                <w:szCs w:val="20"/>
+              </w:rPr>
+              <w:t xml:space="preserve">Technically yes: set LLM_PROVIDER and the matching key. The brief asks for Claude as the central model family, so use Claude for final results and the model comparison.</w:t>
             </w:r>
           </w:p>
         </w:tc>

</xml_diff>